<commit_message>
REST API development with node.js
</commit_message>
<xml_diff>
--- a/study-materials/day-14-nodejs-file-handling.docx
+++ b/study-materials/day-14-nodejs-file-handling.docx
@@ -146,8 +146,6 @@
           <w:lang w:eastAsia="en-IN" w:bidi="hi-IN"/>
         </w:rPr>
       </w:pPr>
-      <w:bookmarkStart w:id="0" w:name="_GoBack"/>
-      <w:bookmarkEnd w:id="0"/>
       <w:r>
         <w:rPr>
           <w:rFonts w:ascii="Segoe UI Symbol" w:eastAsia="Times New Roman" w:hAnsi="Segoe UI Symbol" w:cs="Segoe UI Symbol"/>
@@ -7034,6 +7032,9 @@
           <w:ilvl w:val="0"/>
           <w:numId w:val="3"/>
         </w:numPr>
+        <w:pBdr>
+          <w:bottom w:val="double" w:sz="6" w:space="1" w:color="auto"/>
+        </w:pBdr>
         <w:spacing w:before="100" w:beforeAutospacing="1" w:after="100" w:afterAutospacing="1" w:line="240" w:lineRule="auto"/>
         <w:rPr>
           <w:rFonts w:ascii="Times New Roman" w:eastAsia="Times New Roman" w:hAnsi="Times New Roman" w:cs="Times New Roman"/>
@@ -7052,7 +7053,763 @@
         <w:t>Better error handling with try/catch</w:t>
       </w:r>
     </w:p>
-    <w:p/>
+    <w:p>
+      <w:pPr>
+        <w:spacing w:before="100" w:beforeAutospacing="1" w:after="100" w:afterAutospacing="1" w:line="240" w:lineRule="auto"/>
+        <w:rPr>
+          <w:rFonts w:ascii="Times New Roman" w:eastAsia="Times New Roman" w:hAnsi="Times New Roman" w:cs="Times New Roman"/>
+          <w:sz w:val="24"/>
+          <w:szCs w:val="24"/>
+          <w:lang w:eastAsia="en-IN" w:bidi="hi-IN"/>
+        </w:rPr>
+      </w:pPr>
+      <w:r>
+        <w:rPr>
+          <w:rFonts w:ascii="Times New Roman" w:eastAsia="Times New Roman" w:hAnsi="Times New Roman" w:cs="Times New Roman"/>
+          <w:sz w:val="24"/>
+          <w:szCs w:val="24"/>
+          <w:lang w:eastAsia="en-IN" w:bidi="hi-IN"/>
+        </w:rPr>
+        <w:t xml:space="preserve">I’ve created a complete </w:t>
+      </w:r>
+      <w:r>
+        <w:rPr>
+          <w:rFonts w:ascii="Times New Roman" w:eastAsia="Times New Roman" w:hAnsi="Times New Roman" w:cs="Times New Roman"/>
+          <w:b/>
+          <w:bCs/>
+          <w:sz w:val="24"/>
+          <w:szCs w:val="24"/>
+          <w:lang w:eastAsia="en-IN" w:bidi="hi-IN"/>
+        </w:rPr>
+        <w:t>Node.js File-Based Notes App (CRUD + JSON)</w:t>
+      </w:r>
+      <w:r>
+        <w:rPr>
+          <w:rFonts w:ascii="Times New Roman" w:eastAsia="Times New Roman" w:hAnsi="Times New Roman" w:cs="Times New Roman"/>
+          <w:sz w:val="24"/>
+          <w:szCs w:val="24"/>
+          <w:lang w:eastAsia="en-IN" w:bidi="hi-IN"/>
+        </w:rPr>
+        <w:t xml:space="preserve"> for you in the canvas.</w:t>
+      </w:r>
+    </w:p>
+    <w:p>
+      <w:pPr>
+        <w:spacing w:before="100" w:beforeAutospacing="1" w:after="100" w:afterAutospacing="1" w:line="240" w:lineRule="auto"/>
+        <w:outlineLvl w:val="2"/>
+        <w:rPr>
+          <w:rFonts w:ascii="Times New Roman" w:eastAsia="Times New Roman" w:hAnsi="Times New Roman" w:cs="Times New Roman"/>
+          <w:b/>
+          <w:bCs/>
+          <w:sz w:val="27"/>
+          <w:szCs w:val="27"/>
+          <w:lang w:eastAsia="en-IN" w:bidi="hi-IN"/>
+        </w:rPr>
+      </w:pPr>
+      <w:r>
+        <w:rPr>
+          <w:rFonts w:ascii="Times New Roman" w:eastAsia="Times New Roman" w:hAnsi="Times New Roman" w:cs="Times New Roman"/>
+          <w:b/>
+          <w:bCs/>
+          <w:sz w:val="27"/>
+          <w:szCs w:val="27"/>
+          <w:lang w:eastAsia="en-IN" w:bidi="hi-IN"/>
+        </w:rPr>
+        <w:t>What this project covers:</w:t>
+      </w:r>
+    </w:p>
+    <w:p>
+      <w:pPr>
+        <w:numPr>
+          <w:ilvl w:val="0"/>
+          <w:numId w:val="5"/>
+        </w:numPr>
+        <w:spacing w:before="100" w:beforeAutospacing="1" w:after="100" w:afterAutospacing="1" w:line="240" w:lineRule="auto"/>
+        <w:rPr>
+          <w:rFonts w:ascii="Times New Roman" w:eastAsia="Times New Roman" w:hAnsi="Times New Roman" w:cs="Times New Roman"/>
+          <w:sz w:val="24"/>
+          <w:szCs w:val="24"/>
+          <w:lang w:eastAsia="en-IN" w:bidi="hi-IN"/>
+        </w:rPr>
+      </w:pPr>
+      <w:r>
+        <w:rPr>
+          <w:rFonts w:ascii="Times New Roman" w:eastAsia="Times New Roman" w:hAnsi="Times New Roman" w:cs="Times New Roman"/>
+          <w:sz w:val="24"/>
+          <w:szCs w:val="24"/>
+          <w:lang w:eastAsia="en-IN" w:bidi="hi-IN"/>
+        </w:rPr>
+        <w:t xml:space="preserve">File handling using </w:t>
+      </w:r>
+      <w:proofErr w:type="spellStart"/>
+      <w:proofErr w:type="gramStart"/>
+      <w:r>
+        <w:rPr>
+          <w:rFonts w:ascii="Courier New" w:eastAsia="Times New Roman" w:hAnsi="Courier New" w:cs="Courier New"/>
+          <w:sz w:val="20"/>
+          <w:szCs w:val="20"/>
+          <w:lang w:eastAsia="en-IN" w:bidi="hi-IN"/>
+        </w:rPr>
+        <w:t>fs.promises</w:t>
+      </w:r>
+      <w:proofErr w:type="spellEnd"/>
+      <w:proofErr w:type="gramEnd"/>
+    </w:p>
+    <w:p>
+      <w:pPr>
+        <w:numPr>
+          <w:ilvl w:val="0"/>
+          <w:numId w:val="5"/>
+        </w:numPr>
+        <w:spacing w:before="100" w:beforeAutospacing="1" w:after="100" w:afterAutospacing="1" w:line="240" w:lineRule="auto"/>
+        <w:rPr>
+          <w:rFonts w:ascii="Times New Roman" w:eastAsia="Times New Roman" w:hAnsi="Times New Roman" w:cs="Times New Roman"/>
+          <w:sz w:val="24"/>
+          <w:szCs w:val="24"/>
+          <w:lang w:eastAsia="en-IN" w:bidi="hi-IN"/>
+        </w:rPr>
+      </w:pPr>
+      <w:r>
+        <w:rPr>
+          <w:rFonts w:ascii="Times New Roman" w:eastAsia="Times New Roman" w:hAnsi="Times New Roman" w:cs="Times New Roman"/>
+          <w:sz w:val="24"/>
+          <w:szCs w:val="24"/>
+          <w:lang w:eastAsia="en-IN" w:bidi="hi-IN"/>
+        </w:rPr>
+        <w:t>CRUD operations (Create, Read, Update, Delete)</w:t>
+      </w:r>
+    </w:p>
+    <w:p>
+      <w:pPr>
+        <w:numPr>
+          <w:ilvl w:val="0"/>
+          <w:numId w:val="5"/>
+        </w:numPr>
+        <w:spacing w:before="100" w:beforeAutospacing="1" w:after="100" w:afterAutospacing="1" w:line="240" w:lineRule="auto"/>
+        <w:rPr>
+          <w:rFonts w:ascii="Times New Roman" w:eastAsia="Times New Roman" w:hAnsi="Times New Roman" w:cs="Times New Roman"/>
+          <w:sz w:val="24"/>
+          <w:szCs w:val="24"/>
+          <w:lang w:eastAsia="en-IN" w:bidi="hi-IN"/>
+        </w:rPr>
+      </w:pPr>
+      <w:r>
+        <w:rPr>
+          <w:rFonts w:ascii="Times New Roman" w:eastAsia="Times New Roman" w:hAnsi="Times New Roman" w:cs="Times New Roman"/>
+          <w:sz w:val="24"/>
+          <w:szCs w:val="24"/>
+          <w:lang w:eastAsia="en-IN" w:bidi="hi-IN"/>
+        </w:rPr>
+        <w:t>JSON-based data storage</w:t>
+      </w:r>
+    </w:p>
+    <w:p>
+      <w:pPr>
+        <w:numPr>
+          <w:ilvl w:val="0"/>
+          <w:numId w:val="5"/>
+        </w:numPr>
+        <w:spacing w:before="100" w:beforeAutospacing="1" w:after="100" w:afterAutospacing="1" w:line="240" w:lineRule="auto"/>
+        <w:rPr>
+          <w:rFonts w:ascii="Times New Roman" w:eastAsia="Times New Roman" w:hAnsi="Times New Roman" w:cs="Times New Roman"/>
+          <w:sz w:val="24"/>
+          <w:szCs w:val="24"/>
+          <w:lang w:eastAsia="en-IN" w:bidi="hi-IN"/>
+        </w:rPr>
+      </w:pPr>
+      <w:proofErr w:type="spellStart"/>
+      <w:r>
+        <w:rPr>
+          <w:rFonts w:ascii="Times New Roman" w:eastAsia="Times New Roman" w:hAnsi="Times New Roman" w:cs="Times New Roman"/>
+          <w:sz w:val="24"/>
+          <w:szCs w:val="24"/>
+          <w:lang w:eastAsia="en-IN" w:bidi="hi-IN"/>
+        </w:rPr>
+        <w:t>Async</w:t>
+      </w:r>
+      <w:proofErr w:type="spellEnd"/>
+      <w:r>
+        <w:rPr>
+          <w:rFonts w:ascii="Times New Roman" w:eastAsia="Times New Roman" w:hAnsi="Times New Roman" w:cs="Times New Roman"/>
+          <w:sz w:val="24"/>
+          <w:szCs w:val="24"/>
+          <w:lang w:eastAsia="en-IN" w:bidi="hi-IN"/>
+        </w:rPr>
+        <w:t>/Await usage</w:t>
+      </w:r>
+    </w:p>
+    <w:p>
+      <w:pPr>
+        <w:numPr>
+          <w:ilvl w:val="0"/>
+          <w:numId w:val="5"/>
+        </w:numPr>
+        <w:spacing w:before="100" w:beforeAutospacing="1" w:after="100" w:afterAutospacing="1" w:line="240" w:lineRule="auto"/>
+        <w:rPr>
+          <w:rFonts w:ascii="Times New Roman" w:eastAsia="Times New Roman" w:hAnsi="Times New Roman" w:cs="Times New Roman"/>
+          <w:sz w:val="24"/>
+          <w:szCs w:val="24"/>
+          <w:lang w:eastAsia="en-IN" w:bidi="hi-IN"/>
+        </w:rPr>
+      </w:pPr>
+      <w:r>
+        <w:rPr>
+          <w:rFonts w:ascii="Times New Roman" w:eastAsia="Times New Roman" w:hAnsi="Times New Roman" w:cs="Times New Roman"/>
+          <w:sz w:val="24"/>
+          <w:szCs w:val="24"/>
+          <w:lang w:eastAsia="en-IN" w:bidi="hi-IN"/>
+        </w:rPr>
+        <w:t>Real-world structure (</w:t>
+      </w:r>
+      <w:proofErr w:type="spellStart"/>
+      <w:r>
+        <w:rPr>
+          <w:rFonts w:ascii="Times New Roman" w:eastAsia="Times New Roman" w:hAnsi="Times New Roman" w:cs="Times New Roman"/>
+          <w:sz w:val="24"/>
+          <w:szCs w:val="24"/>
+          <w:lang w:eastAsia="en-IN" w:bidi="hi-IN"/>
+        </w:rPr>
+        <w:t>init</w:t>
+      </w:r>
+      <w:proofErr w:type="spellEnd"/>
+      <w:r>
+        <w:rPr>
+          <w:rFonts w:ascii="Times New Roman" w:eastAsia="Times New Roman" w:hAnsi="Times New Roman" w:cs="Times New Roman"/>
+          <w:sz w:val="24"/>
+          <w:szCs w:val="24"/>
+          <w:lang w:eastAsia="en-IN" w:bidi="hi-IN"/>
+        </w:rPr>
+        <w:t>, service functions, flow)</w:t>
+      </w:r>
+    </w:p>
+    <w:p>
+      <w:pPr>
+        <w:spacing w:after="0" w:line="240" w:lineRule="auto"/>
+        <w:rPr>
+          <w:rFonts w:ascii="Times New Roman" w:eastAsia="Times New Roman" w:hAnsi="Times New Roman" w:cs="Times New Roman"/>
+          <w:sz w:val="24"/>
+          <w:szCs w:val="24"/>
+          <w:lang w:eastAsia="en-IN" w:bidi="hi-IN"/>
+        </w:rPr>
+      </w:pPr>
+      <w:r>
+        <w:rPr>
+          <w:rFonts w:ascii="Times New Roman" w:eastAsia="Times New Roman" w:hAnsi="Times New Roman" w:cs="Times New Roman"/>
+          <w:sz w:val="24"/>
+          <w:szCs w:val="24"/>
+          <w:lang w:eastAsia="en-IN" w:bidi="hi-IN"/>
+        </w:rPr>
+        <w:pict>
+          <v:rect id="_x0000_i1069" style="width:0;height:1.5pt" o:hralign="center" o:hrstd="t" o:hr="t" fillcolor="#a0a0a0" stroked="f"/>
+        </w:pict>
+      </w:r>
+    </w:p>
+    <w:p>
+      <w:pPr>
+        <w:spacing w:before="100" w:beforeAutospacing="1" w:after="100" w:afterAutospacing="1" w:line="240" w:lineRule="auto"/>
+        <w:outlineLvl w:val="1"/>
+        <w:rPr>
+          <w:rFonts w:ascii="Times New Roman" w:eastAsia="Times New Roman" w:hAnsi="Times New Roman" w:cs="Times New Roman"/>
+          <w:b/>
+          <w:bCs/>
+          <w:sz w:val="36"/>
+          <w:szCs w:val="36"/>
+          <w:lang w:eastAsia="en-IN" w:bidi="hi-IN"/>
+        </w:rPr>
+      </w:pPr>
+      <w:r>
+        <w:rPr>
+          <w:rFonts w:ascii="Times New Roman" w:eastAsia="Times New Roman" w:hAnsi="Times New Roman" w:cs="Times New Roman"/>
+          <w:b/>
+          <w:bCs/>
+          <w:sz w:val="36"/>
+          <w:szCs w:val="36"/>
+          <w:lang w:eastAsia="en-IN" w:bidi="hi-IN"/>
+        </w:rPr>
+        <w:t>🧠 How to run it</w:t>
+      </w:r>
+    </w:p>
+    <w:p>
+      <w:pPr>
+        <w:numPr>
+          <w:ilvl w:val="0"/>
+          <w:numId w:val="6"/>
+        </w:numPr>
+        <w:spacing w:before="100" w:beforeAutospacing="1" w:after="100" w:afterAutospacing="1" w:line="240" w:lineRule="auto"/>
+        <w:rPr>
+          <w:rFonts w:ascii="Times New Roman" w:eastAsia="Times New Roman" w:hAnsi="Times New Roman" w:cs="Times New Roman"/>
+          <w:sz w:val="24"/>
+          <w:szCs w:val="24"/>
+          <w:lang w:eastAsia="en-IN" w:bidi="hi-IN"/>
+        </w:rPr>
+      </w:pPr>
+      <w:r>
+        <w:rPr>
+          <w:rFonts w:ascii="Times New Roman" w:eastAsia="Times New Roman" w:hAnsi="Times New Roman" w:cs="Times New Roman"/>
+          <w:sz w:val="24"/>
+          <w:szCs w:val="24"/>
+          <w:lang w:eastAsia="en-IN" w:bidi="hi-IN"/>
+        </w:rPr>
+        <w:t>Create a folder</w:t>
+      </w:r>
+    </w:p>
+    <w:p>
+      <w:pPr>
+        <w:numPr>
+          <w:ilvl w:val="0"/>
+          <w:numId w:val="6"/>
+        </w:numPr>
+        <w:spacing w:before="100" w:beforeAutospacing="1" w:after="100" w:afterAutospacing="1" w:line="240" w:lineRule="auto"/>
+        <w:rPr>
+          <w:rFonts w:ascii="Times New Roman" w:eastAsia="Times New Roman" w:hAnsi="Times New Roman" w:cs="Times New Roman"/>
+          <w:sz w:val="24"/>
+          <w:szCs w:val="24"/>
+          <w:lang w:eastAsia="en-IN" w:bidi="hi-IN"/>
+        </w:rPr>
+      </w:pPr>
+      <w:r>
+        <w:rPr>
+          <w:rFonts w:ascii="Times New Roman" w:eastAsia="Times New Roman" w:hAnsi="Times New Roman" w:cs="Times New Roman"/>
+          <w:sz w:val="24"/>
+          <w:szCs w:val="24"/>
+          <w:lang w:eastAsia="en-IN" w:bidi="hi-IN"/>
+        </w:rPr>
+        <w:t xml:space="preserve">Save the file as </w:t>
+      </w:r>
+      <w:r>
+        <w:rPr>
+          <w:rFonts w:ascii="Courier New" w:eastAsia="Times New Roman" w:hAnsi="Courier New" w:cs="Courier New"/>
+          <w:sz w:val="20"/>
+          <w:szCs w:val="20"/>
+          <w:lang w:eastAsia="en-IN" w:bidi="hi-IN"/>
+        </w:rPr>
+        <w:t>app.js</w:t>
+      </w:r>
+    </w:p>
+    <w:p>
+      <w:pPr>
+        <w:numPr>
+          <w:ilvl w:val="0"/>
+          <w:numId w:val="6"/>
+        </w:numPr>
+        <w:spacing w:before="100" w:beforeAutospacing="1" w:after="100" w:afterAutospacing="1" w:line="240" w:lineRule="auto"/>
+        <w:rPr>
+          <w:rFonts w:ascii="Times New Roman" w:eastAsia="Times New Roman" w:hAnsi="Times New Roman" w:cs="Times New Roman"/>
+          <w:sz w:val="24"/>
+          <w:szCs w:val="24"/>
+          <w:lang w:eastAsia="en-IN" w:bidi="hi-IN"/>
+        </w:rPr>
+      </w:pPr>
+      <w:r>
+        <w:rPr>
+          <w:rFonts w:ascii="Times New Roman" w:eastAsia="Times New Roman" w:hAnsi="Times New Roman" w:cs="Times New Roman"/>
+          <w:sz w:val="24"/>
+          <w:szCs w:val="24"/>
+          <w:lang w:eastAsia="en-IN" w:bidi="hi-IN"/>
+        </w:rPr>
+        <w:t>Run:</w:t>
+      </w:r>
+    </w:p>
+    <w:p>
+      <w:pPr>
+        <w:tabs>
+          <w:tab w:val="left" w:pos="916"/>
+          <w:tab w:val="left" w:pos="1832"/>
+          <w:tab w:val="left" w:pos="2748"/>
+          <w:tab w:val="left" w:pos="3664"/>
+          <w:tab w:val="left" w:pos="4580"/>
+          <w:tab w:val="left" w:pos="5496"/>
+          <w:tab w:val="left" w:pos="6412"/>
+          <w:tab w:val="left" w:pos="7328"/>
+          <w:tab w:val="left" w:pos="8244"/>
+          <w:tab w:val="left" w:pos="9160"/>
+          <w:tab w:val="left" w:pos="10076"/>
+          <w:tab w:val="left" w:pos="10992"/>
+          <w:tab w:val="left" w:pos="11908"/>
+          <w:tab w:val="left" w:pos="12824"/>
+          <w:tab w:val="left" w:pos="13740"/>
+          <w:tab w:val="left" w:pos="14656"/>
+        </w:tabs>
+        <w:spacing w:after="0" w:line="240" w:lineRule="auto"/>
+        <w:rPr>
+          <w:rFonts w:ascii="Courier New" w:eastAsia="Times New Roman" w:hAnsi="Courier New" w:cs="Courier New"/>
+          <w:sz w:val="20"/>
+          <w:szCs w:val="20"/>
+          <w:lang w:eastAsia="en-IN" w:bidi="hi-IN"/>
+        </w:rPr>
+      </w:pPr>
+      <w:r>
+        <w:rPr>
+          <w:rFonts w:ascii="Courier New" w:eastAsia="Times New Roman" w:hAnsi="Courier New" w:cs="Courier New"/>
+          <w:sz w:val="20"/>
+          <w:szCs w:val="20"/>
+          <w:lang w:eastAsia="en-IN" w:bidi="hi-IN"/>
+        </w:rPr>
+        <w:lastRenderedPageBreak/>
+        <w:t>node app.js</w:t>
+      </w:r>
+    </w:p>
+    <w:p>
+      <w:pPr>
+        <w:spacing w:before="100" w:beforeAutospacing="1" w:after="100" w:afterAutospacing="1" w:line="240" w:lineRule="auto"/>
+        <w:rPr>
+          <w:rFonts w:ascii="Times New Roman" w:eastAsia="Times New Roman" w:hAnsi="Times New Roman" w:cs="Times New Roman"/>
+          <w:sz w:val="24"/>
+          <w:szCs w:val="24"/>
+          <w:lang w:eastAsia="en-IN" w:bidi="hi-IN"/>
+        </w:rPr>
+      </w:pPr>
+      <w:r>
+        <w:rPr>
+          <w:rFonts w:ascii="Times New Roman" w:eastAsia="Times New Roman" w:hAnsi="Times New Roman" w:cs="Times New Roman"/>
+          <w:sz w:val="24"/>
+          <w:szCs w:val="24"/>
+          <w:lang w:eastAsia="en-IN" w:bidi="hi-IN"/>
+        </w:rPr>
+        <w:t>It will automatically:</w:t>
+      </w:r>
+    </w:p>
+    <w:p>
+      <w:pPr>
+        <w:numPr>
+          <w:ilvl w:val="0"/>
+          <w:numId w:val="7"/>
+        </w:numPr>
+        <w:spacing w:before="100" w:beforeAutospacing="1" w:after="100" w:afterAutospacing="1" w:line="240" w:lineRule="auto"/>
+        <w:rPr>
+          <w:rFonts w:ascii="Times New Roman" w:eastAsia="Times New Roman" w:hAnsi="Times New Roman" w:cs="Times New Roman"/>
+          <w:sz w:val="24"/>
+          <w:szCs w:val="24"/>
+          <w:lang w:eastAsia="en-IN" w:bidi="hi-IN"/>
+        </w:rPr>
+      </w:pPr>
+      <w:r>
+        <w:rPr>
+          <w:rFonts w:ascii="Times New Roman" w:eastAsia="Times New Roman" w:hAnsi="Times New Roman" w:cs="Times New Roman"/>
+          <w:sz w:val="24"/>
+          <w:szCs w:val="24"/>
+          <w:lang w:eastAsia="en-IN" w:bidi="hi-IN"/>
+        </w:rPr>
+        <w:t xml:space="preserve">Create </w:t>
+      </w:r>
+      <w:proofErr w:type="spellStart"/>
+      <w:proofErr w:type="gramStart"/>
+      <w:r>
+        <w:rPr>
+          <w:rFonts w:ascii="Courier New" w:eastAsia="Times New Roman" w:hAnsi="Courier New" w:cs="Courier New"/>
+          <w:sz w:val="20"/>
+          <w:szCs w:val="20"/>
+          <w:lang w:eastAsia="en-IN" w:bidi="hi-IN"/>
+        </w:rPr>
+        <w:t>notes.json</w:t>
+      </w:r>
+      <w:proofErr w:type="spellEnd"/>
+      <w:proofErr w:type="gramEnd"/>
+    </w:p>
+    <w:p>
+      <w:pPr>
+        <w:numPr>
+          <w:ilvl w:val="0"/>
+          <w:numId w:val="7"/>
+        </w:numPr>
+        <w:spacing w:before="100" w:beforeAutospacing="1" w:after="100" w:afterAutospacing="1" w:line="240" w:lineRule="auto"/>
+        <w:rPr>
+          <w:rFonts w:ascii="Times New Roman" w:eastAsia="Times New Roman" w:hAnsi="Times New Roman" w:cs="Times New Roman"/>
+          <w:sz w:val="24"/>
+          <w:szCs w:val="24"/>
+          <w:lang w:eastAsia="en-IN" w:bidi="hi-IN"/>
+        </w:rPr>
+      </w:pPr>
+      <w:r>
+        <w:rPr>
+          <w:rFonts w:ascii="Times New Roman" w:eastAsia="Times New Roman" w:hAnsi="Times New Roman" w:cs="Times New Roman"/>
+          <w:sz w:val="24"/>
+          <w:szCs w:val="24"/>
+          <w:lang w:eastAsia="en-IN" w:bidi="hi-IN"/>
+        </w:rPr>
+        <w:t>Add notes</w:t>
+      </w:r>
+    </w:p>
+    <w:p>
+      <w:pPr>
+        <w:numPr>
+          <w:ilvl w:val="0"/>
+          <w:numId w:val="7"/>
+        </w:numPr>
+        <w:spacing w:before="100" w:beforeAutospacing="1" w:after="100" w:afterAutospacing="1" w:line="240" w:lineRule="auto"/>
+        <w:rPr>
+          <w:rFonts w:ascii="Times New Roman" w:eastAsia="Times New Roman" w:hAnsi="Times New Roman" w:cs="Times New Roman"/>
+          <w:sz w:val="24"/>
+          <w:szCs w:val="24"/>
+          <w:lang w:eastAsia="en-IN" w:bidi="hi-IN"/>
+        </w:rPr>
+      </w:pPr>
+      <w:r>
+        <w:rPr>
+          <w:rFonts w:ascii="Times New Roman" w:eastAsia="Times New Roman" w:hAnsi="Times New Roman" w:cs="Times New Roman"/>
+          <w:sz w:val="24"/>
+          <w:szCs w:val="24"/>
+          <w:lang w:eastAsia="en-IN" w:bidi="hi-IN"/>
+        </w:rPr>
+        <w:t>Read, update, delete them</w:t>
+      </w:r>
+    </w:p>
+    <w:p>
+      <w:pPr>
+        <w:spacing w:after="0" w:line="240" w:lineRule="auto"/>
+        <w:rPr>
+          <w:rFonts w:ascii="Times New Roman" w:eastAsia="Times New Roman" w:hAnsi="Times New Roman" w:cs="Times New Roman"/>
+          <w:sz w:val="24"/>
+          <w:szCs w:val="24"/>
+          <w:lang w:eastAsia="en-IN" w:bidi="hi-IN"/>
+        </w:rPr>
+      </w:pPr>
+      <w:r>
+        <w:rPr>
+          <w:rFonts w:ascii="Times New Roman" w:eastAsia="Times New Roman" w:hAnsi="Times New Roman" w:cs="Times New Roman"/>
+          <w:sz w:val="24"/>
+          <w:szCs w:val="24"/>
+          <w:lang w:eastAsia="en-IN" w:bidi="hi-IN"/>
+        </w:rPr>
+        <w:pict>
+          <v:rect id="_x0000_i1070" style="width:0;height:1.5pt" o:hralign="center" o:hrstd="t" o:hr="t" fillcolor="#a0a0a0" stroked="f"/>
+        </w:pict>
+      </w:r>
+    </w:p>
+    <w:p>
+      <w:pPr>
+        <w:spacing w:before="100" w:beforeAutospacing="1" w:after="100" w:afterAutospacing="1" w:line="240" w:lineRule="auto"/>
+        <w:rPr>
+          <w:rFonts w:ascii="Times New Roman" w:eastAsia="Times New Roman" w:hAnsi="Times New Roman" w:cs="Times New Roman"/>
+          <w:sz w:val="24"/>
+          <w:szCs w:val="24"/>
+          <w:lang w:eastAsia="en-IN" w:bidi="hi-IN"/>
+        </w:rPr>
+      </w:pPr>
+      <w:r>
+        <w:rPr>
+          <w:rFonts w:ascii="Times New Roman" w:eastAsia="Times New Roman" w:hAnsi="Times New Roman" w:cs="Times New Roman"/>
+          <w:sz w:val="24"/>
+          <w:szCs w:val="24"/>
+          <w:lang w:eastAsia="en-IN" w:bidi="hi-IN"/>
+        </w:rPr>
+        <w:t>Run these commands in terminal:</w:t>
+      </w:r>
+    </w:p>
+    <w:p>
+      <w:pPr>
+        <w:tabs>
+          <w:tab w:val="left" w:pos="916"/>
+          <w:tab w:val="left" w:pos="1832"/>
+          <w:tab w:val="left" w:pos="2748"/>
+          <w:tab w:val="left" w:pos="3664"/>
+          <w:tab w:val="left" w:pos="4580"/>
+          <w:tab w:val="left" w:pos="5496"/>
+          <w:tab w:val="left" w:pos="6412"/>
+          <w:tab w:val="left" w:pos="7328"/>
+          <w:tab w:val="left" w:pos="8244"/>
+          <w:tab w:val="left" w:pos="9160"/>
+          <w:tab w:val="left" w:pos="10076"/>
+          <w:tab w:val="left" w:pos="10992"/>
+          <w:tab w:val="left" w:pos="11908"/>
+          <w:tab w:val="left" w:pos="12824"/>
+          <w:tab w:val="left" w:pos="13740"/>
+          <w:tab w:val="left" w:pos="14656"/>
+        </w:tabs>
+        <w:spacing w:after="0" w:line="240" w:lineRule="auto"/>
+        <w:rPr>
+          <w:rFonts w:ascii="Courier New" w:eastAsia="Times New Roman" w:hAnsi="Courier New" w:cs="Courier New"/>
+          <w:sz w:val="20"/>
+          <w:szCs w:val="20"/>
+          <w:lang w:eastAsia="en-IN" w:bidi="hi-IN"/>
+        </w:rPr>
+      </w:pPr>
+      <w:r>
+        <w:rPr>
+          <w:rFonts w:ascii="Courier New" w:eastAsia="Times New Roman" w:hAnsi="Courier New" w:cs="Courier New"/>
+          <w:sz w:val="20"/>
+          <w:szCs w:val="20"/>
+          <w:lang w:eastAsia="en-IN" w:bidi="hi-IN"/>
+        </w:rPr>
+        <w:t>node app.js add "Title" "Content"</w:t>
+      </w:r>
+      <w:r>
+        <w:rPr>
+          <w:rFonts w:ascii="Courier New" w:eastAsia="Times New Roman" w:hAnsi="Courier New" w:cs="Courier New"/>
+          <w:sz w:val="20"/>
+          <w:szCs w:val="20"/>
+          <w:lang w:eastAsia="en-IN" w:bidi="hi-IN"/>
+        </w:rPr>
+        <w:br/>
+        <w:t>node app.js list</w:t>
+      </w:r>
+      <w:r>
+        <w:rPr>
+          <w:rFonts w:ascii="Courier New" w:eastAsia="Times New Roman" w:hAnsi="Courier New" w:cs="Courier New"/>
+          <w:sz w:val="20"/>
+          <w:szCs w:val="20"/>
+          <w:lang w:eastAsia="en-IN" w:bidi="hi-IN"/>
+        </w:rPr>
+        <w:br/>
+        <w:t>node app.js get &lt;id&gt;</w:t>
+      </w:r>
+      <w:r>
+        <w:rPr>
+          <w:rFonts w:ascii="Courier New" w:eastAsia="Times New Roman" w:hAnsi="Courier New" w:cs="Courier New"/>
+          <w:sz w:val="20"/>
+          <w:szCs w:val="20"/>
+          <w:lang w:eastAsia="en-IN" w:bidi="hi-IN"/>
+        </w:rPr>
+        <w:br/>
+        <w:t>node app.js update &lt;id&gt; "New Content"</w:t>
+      </w:r>
+      <w:r>
+        <w:rPr>
+          <w:rFonts w:ascii="Courier New" w:eastAsia="Times New Roman" w:hAnsi="Courier New" w:cs="Courier New"/>
+          <w:sz w:val="20"/>
+          <w:szCs w:val="20"/>
+          <w:lang w:eastAsia="en-IN" w:bidi="hi-IN"/>
+        </w:rPr>
+        <w:br/>
+        <w:t>node app.js delete &lt;id&gt;</w:t>
+      </w:r>
+    </w:p>
+    <w:p>
+      <w:pPr>
+        <w:spacing w:after="0" w:line="240" w:lineRule="auto"/>
+        <w:rPr>
+          <w:rFonts w:ascii="Times New Roman" w:eastAsia="Times New Roman" w:hAnsi="Times New Roman" w:cs="Times New Roman"/>
+          <w:sz w:val="24"/>
+          <w:szCs w:val="24"/>
+          <w:lang w:eastAsia="en-IN" w:bidi="hi-IN"/>
+        </w:rPr>
+      </w:pPr>
+      <w:r>
+        <w:rPr>
+          <w:rFonts w:ascii="Times New Roman" w:eastAsia="Times New Roman" w:hAnsi="Times New Roman" w:cs="Times New Roman"/>
+          <w:sz w:val="24"/>
+          <w:szCs w:val="24"/>
+          <w:lang w:eastAsia="en-IN" w:bidi="hi-IN"/>
+        </w:rPr>
+        <w:pict>
+          <v:rect id="_x0000_i1086" style="width:0;height:1.5pt" o:hralign="center" o:hrstd="t" o:hr="t" fillcolor="#a0a0a0" stroked="f"/>
+        </w:pict>
+      </w:r>
+    </w:p>
+    <w:p>
+      <w:pPr>
+        <w:spacing w:before="100" w:beforeAutospacing="1" w:after="100" w:afterAutospacing="1" w:line="240" w:lineRule="auto"/>
+        <w:outlineLvl w:val="2"/>
+        <w:rPr>
+          <w:rFonts w:ascii="Times New Roman" w:eastAsia="Times New Roman" w:hAnsi="Times New Roman" w:cs="Times New Roman"/>
+          <w:b/>
+          <w:bCs/>
+          <w:sz w:val="27"/>
+          <w:szCs w:val="27"/>
+          <w:lang w:eastAsia="en-IN" w:bidi="hi-IN"/>
+        </w:rPr>
+      </w:pPr>
+      <w:r>
+        <w:rPr>
+          <w:rFonts w:ascii="Times New Roman" w:eastAsia="Times New Roman" w:hAnsi="Times New Roman" w:cs="Times New Roman"/>
+          <w:b/>
+          <w:bCs/>
+          <w:sz w:val="27"/>
+          <w:szCs w:val="27"/>
+          <w:lang w:eastAsia="en-IN" w:bidi="hi-IN"/>
+        </w:rPr>
+        <w:t>🧠 What you just learned (important)</w:t>
+      </w:r>
+    </w:p>
+    <w:p>
+      <w:pPr>
+        <w:numPr>
+          <w:ilvl w:val="0"/>
+          <w:numId w:val="10"/>
+        </w:numPr>
+        <w:spacing w:before="100" w:beforeAutospacing="1" w:after="100" w:afterAutospacing="1" w:line="240" w:lineRule="auto"/>
+        <w:rPr>
+          <w:rFonts w:ascii="Times New Roman" w:eastAsia="Times New Roman" w:hAnsi="Times New Roman" w:cs="Times New Roman"/>
+          <w:sz w:val="24"/>
+          <w:szCs w:val="24"/>
+          <w:lang w:eastAsia="en-IN" w:bidi="hi-IN"/>
+        </w:rPr>
+      </w:pPr>
+      <w:proofErr w:type="spellStart"/>
+      <w:proofErr w:type="gramStart"/>
+      <w:r>
+        <w:rPr>
+          <w:rFonts w:ascii="Courier New" w:eastAsia="Times New Roman" w:hAnsi="Courier New" w:cs="Courier New"/>
+          <w:sz w:val="20"/>
+          <w:szCs w:val="20"/>
+          <w:lang w:eastAsia="en-IN" w:bidi="hi-IN"/>
+        </w:rPr>
+        <w:t>process.argv</w:t>
+      </w:r>
+      <w:proofErr w:type="spellEnd"/>
+      <w:proofErr w:type="gramEnd"/>
+      <w:r>
+        <w:rPr>
+          <w:rFonts w:ascii="Times New Roman" w:eastAsia="Times New Roman" w:hAnsi="Times New Roman" w:cs="Times New Roman"/>
+          <w:sz w:val="24"/>
+          <w:szCs w:val="24"/>
+          <w:lang w:eastAsia="en-IN" w:bidi="hi-IN"/>
+        </w:rPr>
+        <w:t xml:space="preserve"> → how CLI arguments work in Node </w:t>
+      </w:r>
+    </w:p>
+    <w:p>
+      <w:pPr>
+        <w:numPr>
+          <w:ilvl w:val="0"/>
+          <w:numId w:val="10"/>
+        </w:numPr>
+        <w:spacing w:before="100" w:beforeAutospacing="1" w:after="100" w:afterAutospacing="1" w:line="240" w:lineRule="auto"/>
+        <w:rPr>
+          <w:rFonts w:ascii="Times New Roman" w:eastAsia="Times New Roman" w:hAnsi="Times New Roman" w:cs="Times New Roman"/>
+          <w:sz w:val="24"/>
+          <w:szCs w:val="24"/>
+          <w:lang w:eastAsia="en-IN" w:bidi="hi-IN"/>
+        </w:rPr>
+      </w:pPr>
+      <w:r>
+        <w:rPr>
+          <w:rFonts w:ascii="Times New Roman" w:eastAsia="Times New Roman" w:hAnsi="Times New Roman" w:cs="Times New Roman"/>
+          <w:sz w:val="24"/>
+          <w:szCs w:val="24"/>
+          <w:lang w:eastAsia="en-IN" w:bidi="hi-IN"/>
+        </w:rPr>
+        <w:t xml:space="preserve">Command parsing → real-world backend pattern </w:t>
+      </w:r>
+    </w:p>
+    <w:p>
+      <w:pPr>
+        <w:numPr>
+          <w:ilvl w:val="0"/>
+          <w:numId w:val="10"/>
+        </w:numPr>
+        <w:spacing w:before="100" w:beforeAutospacing="1" w:after="100" w:afterAutospacing="1" w:line="240" w:lineRule="auto"/>
+        <w:rPr>
+          <w:rFonts w:ascii="Times New Roman" w:eastAsia="Times New Roman" w:hAnsi="Times New Roman" w:cs="Times New Roman"/>
+          <w:sz w:val="24"/>
+          <w:szCs w:val="24"/>
+          <w:lang w:eastAsia="en-IN" w:bidi="hi-IN"/>
+        </w:rPr>
+      </w:pPr>
+      <w:r>
+        <w:rPr>
+          <w:rFonts w:ascii="Times New Roman" w:eastAsia="Times New Roman" w:hAnsi="Times New Roman" w:cs="Times New Roman"/>
+          <w:sz w:val="24"/>
+          <w:szCs w:val="24"/>
+          <w:lang w:eastAsia="en-IN" w:bidi="hi-IN"/>
+        </w:rPr>
+        <w:t>Stateless operations → similar to APIs</w:t>
+      </w:r>
+    </w:p>
+    <w:p>
+      <w:bookmarkStart w:id="0" w:name="_GoBack"/>
+      <w:bookmarkEnd w:id="0"/>
+    </w:p>
     <w:sectPr>
       <w:pgSz w:w="11906" w:h="16838"/>
       <w:pgMar w:top="1440" w:right="1440" w:bottom="1440" w:left="1440" w:header="708" w:footer="708" w:gutter="0"/>
@@ -7066,9 +7823,9 @@
 <file path=word/numbering.xml><?xml version="1.0" encoding="utf-8"?>
 <w:numbering xmlns:wpc="http://schemas.microsoft.com/office/word/2010/wordprocessingCanvas" xmlns:cx="http://schemas.microsoft.com/office/drawing/2014/chartex" xmlns:cx1="http://schemas.microsoft.com/office/drawing/2015/9/8/chartex" xmlns:mc="http://schemas.openxmlformats.org/markup-compatibility/2006" xmlns:o="urn:schemas-microsoft-com:office:office" xmlns:r="http://schemas.openxmlformats.org/officeDocument/2006/relationships" xmlns:m="http://schemas.openxmlformats.org/officeDocument/2006/math" xmlns:v="urn:schemas-microsoft-com:vml" xmlns:wp14="http://schemas.microsoft.com/office/word/2010/wordprocessingDrawing" xmlns:wp="http://schemas.openxmlformats.org/drawingml/2006/wordprocessingDrawing" xmlns:w10="urn:schemas-microsoft-com:office:word" xmlns:w="http://schemas.openxmlformats.org/wordprocessingml/2006/main" xmlns:w14="http://schemas.microsoft.com/office/word/2010/wordml" xmlns:w15="http://schemas.microsoft.com/office/word/2012/wordml" xmlns:w16se="http://schemas.microsoft.com/office/word/2015/wordml/symex" xmlns:wpg="http://schemas.microsoft.com/office/word/2010/wordprocessingGroup" xmlns:wpi="http://schemas.microsoft.com/office/word/2010/wordprocessingInk" xmlns:wne="http://schemas.microsoft.com/office/word/2006/wordml" xmlns:wps="http://schemas.microsoft.com/office/word/2010/wordprocessingShape" mc:Ignorable="w14 w15 w16se wp14">
   <w:abstractNum w:abstractNumId="0" w15:restartNumberingAfterBreak="0">
-    <w:nsid w:val="291842C7"/>
+    <w:nsid w:val="1B8D38D0"/>
     <w:multiLevelType w:val="multilevel"/>
-    <w:tmpl w:val="18107902"/>
+    <w:tmpl w:val="987A2256"/>
     <w:lvl w:ilvl="0">
       <w:start w:val="1"/>
       <w:numFmt w:val="bullet"/>
@@ -7215,122 +7972,9 @@
     </w:lvl>
   </w:abstractNum>
   <w:abstractNum w:abstractNumId="1" w15:restartNumberingAfterBreak="0">
-    <w:nsid w:val="38346D4E"/>
+    <w:nsid w:val="291842C7"/>
     <w:multiLevelType w:val="multilevel"/>
-    <w:tmpl w:val="438CE0C6"/>
-    <w:lvl w:ilvl="0">
-      <w:start w:val="1"/>
-      <w:numFmt w:val="decimal"/>
-      <w:lvlText w:val="%1."/>
-      <w:lvlJc w:val="left"/>
-      <w:pPr>
-        <w:tabs>
-          <w:tab w:val="num" w:pos="720"/>
-        </w:tabs>
-        <w:ind w:left="720" w:hanging="360"/>
-      </w:pPr>
-    </w:lvl>
-    <w:lvl w:ilvl="1" w:tentative="1">
-      <w:start w:val="1"/>
-      <w:numFmt w:val="decimal"/>
-      <w:lvlText w:val="%2."/>
-      <w:lvlJc w:val="left"/>
-      <w:pPr>
-        <w:tabs>
-          <w:tab w:val="num" w:pos="1440"/>
-        </w:tabs>
-        <w:ind w:left="1440" w:hanging="360"/>
-      </w:pPr>
-    </w:lvl>
-    <w:lvl w:ilvl="2" w:tentative="1">
-      <w:start w:val="1"/>
-      <w:numFmt w:val="decimal"/>
-      <w:lvlText w:val="%3."/>
-      <w:lvlJc w:val="left"/>
-      <w:pPr>
-        <w:tabs>
-          <w:tab w:val="num" w:pos="2160"/>
-        </w:tabs>
-        <w:ind w:left="2160" w:hanging="360"/>
-      </w:pPr>
-    </w:lvl>
-    <w:lvl w:ilvl="3" w:tentative="1">
-      <w:start w:val="1"/>
-      <w:numFmt w:val="decimal"/>
-      <w:lvlText w:val="%4."/>
-      <w:lvlJc w:val="left"/>
-      <w:pPr>
-        <w:tabs>
-          <w:tab w:val="num" w:pos="2880"/>
-        </w:tabs>
-        <w:ind w:left="2880" w:hanging="360"/>
-      </w:pPr>
-    </w:lvl>
-    <w:lvl w:ilvl="4" w:tentative="1">
-      <w:start w:val="1"/>
-      <w:numFmt w:val="decimal"/>
-      <w:lvlText w:val="%5."/>
-      <w:lvlJc w:val="left"/>
-      <w:pPr>
-        <w:tabs>
-          <w:tab w:val="num" w:pos="3600"/>
-        </w:tabs>
-        <w:ind w:left="3600" w:hanging="360"/>
-      </w:pPr>
-    </w:lvl>
-    <w:lvl w:ilvl="5" w:tentative="1">
-      <w:start w:val="1"/>
-      <w:numFmt w:val="decimal"/>
-      <w:lvlText w:val="%6."/>
-      <w:lvlJc w:val="left"/>
-      <w:pPr>
-        <w:tabs>
-          <w:tab w:val="num" w:pos="4320"/>
-        </w:tabs>
-        <w:ind w:left="4320" w:hanging="360"/>
-      </w:pPr>
-    </w:lvl>
-    <w:lvl w:ilvl="6" w:tentative="1">
-      <w:start w:val="1"/>
-      <w:numFmt w:val="decimal"/>
-      <w:lvlText w:val="%7."/>
-      <w:lvlJc w:val="left"/>
-      <w:pPr>
-        <w:tabs>
-          <w:tab w:val="num" w:pos="5040"/>
-        </w:tabs>
-        <w:ind w:left="5040" w:hanging="360"/>
-      </w:pPr>
-    </w:lvl>
-    <w:lvl w:ilvl="7" w:tentative="1">
-      <w:start w:val="1"/>
-      <w:numFmt w:val="decimal"/>
-      <w:lvlText w:val="%8."/>
-      <w:lvlJc w:val="left"/>
-      <w:pPr>
-        <w:tabs>
-          <w:tab w:val="num" w:pos="5760"/>
-        </w:tabs>
-        <w:ind w:left="5760" w:hanging="360"/>
-      </w:pPr>
-    </w:lvl>
-    <w:lvl w:ilvl="8" w:tentative="1">
-      <w:start w:val="1"/>
-      <w:numFmt w:val="decimal"/>
-      <w:lvlText w:val="%9."/>
-      <w:lvlJc w:val="left"/>
-      <w:pPr>
-        <w:tabs>
-          <w:tab w:val="num" w:pos="6480"/>
-        </w:tabs>
-        <w:ind w:left="6480" w:hanging="360"/>
-      </w:pPr>
-    </w:lvl>
-  </w:abstractNum>
-  <w:abstractNum w:abstractNumId="2" w15:restartNumberingAfterBreak="0">
-    <w:nsid w:val="4FF81A1D"/>
-    <w:multiLevelType w:val="multilevel"/>
-    <w:tmpl w:val="0470781C"/>
+    <w:tmpl w:val="18107902"/>
     <w:lvl w:ilvl="0">
       <w:start w:val="1"/>
       <w:numFmt w:val="bullet"/>
@@ -7476,10 +8120,10 @@
       </w:rPr>
     </w:lvl>
   </w:abstractNum>
-  <w:abstractNum w:abstractNumId="3" w15:restartNumberingAfterBreak="0">
-    <w:nsid w:val="7E1C4974"/>
+  <w:abstractNum w:abstractNumId="2" w15:restartNumberingAfterBreak="0">
+    <w:nsid w:val="2A7B70EE"/>
     <w:multiLevelType w:val="multilevel"/>
-    <w:tmpl w:val="468492F6"/>
+    <w:tmpl w:val="6BE6E5BE"/>
     <w:lvl w:ilvl="0">
       <w:start w:val="1"/>
       <w:numFmt w:val="bullet"/>
@@ -7625,17 +8269,1006 @@
       </w:rPr>
     </w:lvl>
   </w:abstractNum>
+  <w:abstractNum w:abstractNumId="3" w15:restartNumberingAfterBreak="0">
+    <w:nsid w:val="38346D4E"/>
+    <w:multiLevelType w:val="multilevel"/>
+    <w:tmpl w:val="438CE0C6"/>
+    <w:lvl w:ilvl="0">
+      <w:start w:val="1"/>
+      <w:numFmt w:val="decimal"/>
+      <w:lvlText w:val="%1."/>
+      <w:lvlJc w:val="left"/>
+      <w:pPr>
+        <w:tabs>
+          <w:tab w:val="num" w:pos="720"/>
+        </w:tabs>
+        <w:ind w:left="720" w:hanging="360"/>
+      </w:pPr>
+    </w:lvl>
+    <w:lvl w:ilvl="1" w:tentative="1">
+      <w:start w:val="1"/>
+      <w:numFmt w:val="decimal"/>
+      <w:lvlText w:val="%2."/>
+      <w:lvlJc w:val="left"/>
+      <w:pPr>
+        <w:tabs>
+          <w:tab w:val="num" w:pos="1440"/>
+        </w:tabs>
+        <w:ind w:left="1440" w:hanging="360"/>
+      </w:pPr>
+    </w:lvl>
+    <w:lvl w:ilvl="2" w:tentative="1">
+      <w:start w:val="1"/>
+      <w:numFmt w:val="decimal"/>
+      <w:lvlText w:val="%3."/>
+      <w:lvlJc w:val="left"/>
+      <w:pPr>
+        <w:tabs>
+          <w:tab w:val="num" w:pos="2160"/>
+        </w:tabs>
+        <w:ind w:left="2160" w:hanging="360"/>
+      </w:pPr>
+    </w:lvl>
+    <w:lvl w:ilvl="3" w:tentative="1">
+      <w:start w:val="1"/>
+      <w:numFmt w:val="decimal"/>
+      <w:lvlText w:val="%4."/>
+      <w:lvlJc w:val="left"/>
+      <w:pPr>
+        <w:tabs>
+          <w:tab w:val="num" w:pos="2880"/>
+        </w:tabs>
+        <w:ind w:left="2880" w:hanging="360"/>
+      </w:pPr>
+    </w:lvl>
+    <w:lvl w:ilvl="4" w:tentative="1">
+      <w:start w:val="1"/>
+      <w:numFmt w:val="decimal"/>
+      <w:lvlText w:val="%5."/>
+      <w:lvlJc w:val="left"/>
+      <w:pPr>
+        <w:tabs>
+          <w:tab w:val="num" w:pos="3600"/>
+        </w:tabs>
+        <w:ind w:left="3600" w:hanging="360"/>
+      </w:pPr>
+    </w:lvl>
+    <w:lvl w:ilvl="5" w:tentative="1">
+      <w:start w:val="1"/>
+      <w:numFmt w:val="decimal"/>
+      <w:lvlText w:val="%6."/>
+      <w:lvlJc w:val="left"/>
+      <w:pPr>
+        <w:tabs>
+          <w:tab w:val="num" w:pos="4320"/>
+        </w:tabs>
+        <w:ind w:left="4320" w:hanging="360"/>
+      </w:pPr>
+    </w:lvl>
+    <w:lvl w:ilvl="6" w:tentative="1">
+      <w:start w:val="1"/>
+      <w:numFmt w:val="decimal"/>
+      <w:lvlText w:val="%7."/>
+      <w:lvlJc w:val="left"/>
+      <w:pPr>
+        <w:tabs>
+          <w:tab w:val="num" w:pos="5040"/>
+        </w:tabs>
+        <w:ind w:left="5040" w:hanging="360"/>
+      </w:pPr>
+    </w:lvl>
+    <w:lvl w:ilvl="7" w:tentative="1">
+      <w:start w:val="1"/>
+      <w:numFmt w:val="decimal"/>
+      <w:lvlText w:val="%8."/>
+      <w:lvlJc w:val="left"/>
+      <w:pPr>
+        <w:tabs>
+          <w:tab w:val="num" w:pos="5760"/>
+        </w:tabs>
+        <w:ind w:left="5760" w:hanging="360"/>
+      </w:pPr>
+    </w:lvl>
+    <w:lvl w:ilvl="8" w:tentative="1">
+      <w:start w:val="1"/>
+      <w:numFmt w:val="decimal"/>
+      <w:lvlText w:val="%9."/>
+      <w:lvlJc w:val="left"/>
+      <w:pPr>
+        <w:tabs>
+          <w:tab w:val="num" w:pos="6480"/>
+        </w:tabs>
+        <w:ind w:left="6480" w:hanging="360"/>
+      </w:pPr>
+    </w:lvl>
+  </w:abstractNum>
+  <w:abstractNum w:abstractNumId="4" w15:restartNumberingAfterBreak="0">
+    <w:nsid w:val="4DA15B28"/>
+    <w:multiLevelType w:val="multilevel"/>
+    <w:tmpl w:val="D3C23B2C"/>
+    <w:lvl w:ilvl="0">
+      <w:start w:val="1"/>
+      <w:numFmt w:val="bullet"/>
+      <w:lvlText w:val=""/>
+      <w:lvlJc w:val="left"/>
+      <w:pPr>
+        <w:tabs>
+          <w:tab w:val="num" w:pos="720"/>
+        </w:tabs>
+        <w:ind w:left="720" w:hanging="360"/>
+      </w:pPr>
+      <w:rPr>
+        <w:rFonts w:ascii="Symbol" w:hAnsi="Symbol" w:hint="default"/>
+        <w:sz w:val="20"/>
+      </w:rPr>
+    </w:lvl>
+    <w:lvl w:ilvl="1" w:tentative="1">
+      <w:start w:val="1"/>
+      <w:numFmt w:val="bullet"/>
+      <w:lvlText w:val="o"/>
+      <w:lvlJc w:val="left"/>
+      <w:pPr>
+        <w:tabs>
+          <w:tab w:val="num" w:pos="1440"/>
+        </w:tabs>
+        <w:ind w:left="1440" w:hanging="360"/>
+      </w:pPr>
+      <w:rPr>
+        <w:rFonts w:ascii="Courier New" w:hAnsi="Courier New" w:hint="default"/>
+        <w:sz w:val="20"/>
+      </w:rPr>
+    </w:lvl>
+    <w:lvl w:ilvl="2" w:tentative="1">
+      <w:start w:val="1"/>
+      <w:numFmt w:val="bullet"/>
+      <w:lvlText w:val=""/>
+      <w:lvlJc w:val="left"/>
+      <w:pPr>
+        <w:tabs>
+          <w:tab w:val="num" w:pos="2160"/>
+        </w:tabs>
+        <w:ind w:left="2160" w:hanging="360"/>
+      </w:pPr>
+      <w:rPr>
+        <w:rFonts w:ascii="Wingdings" w:hAnsi="Wingdings" w:hint="default"/>
+        <w:sz w:val="20"/>
+      </w:rPr>
+    </w:lvl>
+    <w:lvl w:ilvl="3" w:tentative="1">
+      <w:start w:val="1"/>
+      <w:numFmt w:val="bullet"/>
+      <w:lvlText w:val=""/>
+      <w:lvlJc w:val="left"/>
+      <w:pPr>
+        <w:tabs>
+          <w:tab w:val="num" w:pos="2880"/>
+        </w:tabs>
+        <w:ind w:left="2880" w:hanging="360"/>
+      </w:pPr>
+      <w:rPr>
+        <w:rFonts w:ascii="Wingdings" w:hAnsi="Wingdings" w:hint="default"/>
+        <w:sz w:val="20"/>
+      </w:rPr>
+    </w:lvl>
+    <w:lvl w:ilvl="4" w:tentative="1">
+      <w:start w:val="1"/>
+      <w:numFmt w:val="bullet"/>
+      <w:lvlText w:val=""/>
+      <w:lvlJc w:val="left"/>
+      <w:pPr>
+        <w:tabs>
+          <w:tab w:val="num" w:pos="3600"/>
+        </w:tabs>
+        <w:ind w:left="3600" w:hanging="360"/>
+      </w:pPr>
+      <w:rPr>
+        <w:rFonts w:ascii="Wingdings" w:hAnsi="Wingdings" w:hint="default"/>
+        <w:sz w:val="20"/>
+      </w:rPr>
+    </w:lvl>
+    <w:lvl w:ilvl="5" w:tentative="1">
+      <w:start w:val="1"/>
+      <w:numFmt w:val="bullet"/>
+      <w:lvlText w:val=""/>
+      <w:lvlJc w:val="left"/>
+      <w:pPr>
+        <w:tabs>
+          <w:tab w:val="num" w:pos="4320"/>
+        </w:tabs>
+        <w:ind w:left="4320" w:hanging="360"/>
+      </w:pPr>
+      <w:rPr>
+        <w:rFonts w:ascii="Wingdings" w:hAnsi="Wingdings" w:hint="default"/>
+        <w:sz w:val="20"/>
+      </w:rPr>
+    </w:lvl>
+    <w:lvl w:ilvl="6" w:tentative="1">
+      <w:start w:val="1"/>
+      <w:numFmt w:val="bullet"/>
+      <w:lvlText w:val=""/>
+      <w:lvlJc w:val="left"/>
+      <w:pPr>
+        <w:tabs>
+          <w:tab w:val="num" w:pos="5040"/>
+        </w:tabs>
+        <w:ind w:left="5040" w:hanging="360"/>
+      </w:pPr>
+      <w:rPr>
+        <w:rFonts w:ascii="Wingdings" w:hAnsi="Wingdings" w:hint="default"/>
+        <w:sz w:val="20"/>
+      </w:rPr>
+    </w:lvl>
+    <w:lvl w:ilvl="7" w:tentative="1">
+      <w:start w:val="1"/>
+      <w:numFmt w:val="bullet"/>
+      <w:lvlText w:val=""/>
+      <w:lvlJc w:val="left"/>
+      <w:pPr>
+        <w:tabs>
+          <w:tab w:val="num" w:pos="5760"/>
+        </w:tabs>
+        <w:ind w:left="5760" w:hanging="360"/>
+      </w:pPr>
+      <w:rPr>
+        <w:rFonts w:ascii="Wingdings" w:hAnsi="Wingdings" w:hint="default"/>
+        <w:sz w:val="20"/>
+      </w:rPr>
+    </w:lvl>
+    <w:lvl w:ilvl="8" w:tentative="1">
+      <w:start w:val="1"/>
+      <w:numFmt w:val="bullet"/>
+      <w:lvlText w:val=""/>
+      <w:lvlJc w:val="left"/>
+      <w:pPr>
+        <w:tabs>
+          <w:tab w:val="num" w:pos="6480"/>
+        </w:tabs>
+        <w:ind w:left="6480" w:hanging="360"/>
+      </w:pPr>
+      <w:rPr>
+        <w:rFonts w:ascii="Wingdings" w:hAnsi="Wingdings" w:hint="default"/>
+        <w:sz w:val="20"/>
+      </w:rPr>
+    </w:lvl>
+  </w:abstractNum>
+  <w:abstractNum w:abstractNumId="5" w15:restartNumberingAfterBreak="0">
+    <w:nsid w:val="4FF81A1D"/>
+    <w:multiLevelType w:val="multilevel"/>
+    <w:tmpl w:val="0470781C"/>
+    <w:lvl w:ilvl="0">
+      <w:start w:val="1"/>
+      <w:numFmt w:val="bullet"/>
+      <w:lvlText w:val=""/>
+      <w:lvlJc w:val="left"/>
+      <w:pPr>
+        <w:tabs>
+          <w:tab w:val="num" w:pos="720"/>
+        </w:tabs>
+        <w:ind w:left="720" w:hanging="360"/>
+      </w:pPr>
+      <w:rPr>
+        <w:rFonts w:ascii="Symbol" w:hAnsi="Symbol" w:hint="default"/>
+        <w:sz w:val="20"/>
+      </w:rPr>
+    </w:lvl>
+    <w:lvl w:ilvl="1" w:tentative="1">
+      <w:start w:val="1"/>
+      <w:numFmt w:val="bullet"/>
+      <w:lvlText w:val="o"/>
+      <w:lvlJc w:val="left"/>
+      <w:pPr>
+        <w:tabs>
+          <w:tab w:val="num" w:pos="1440"/>
+        </w:tabs>
+        <w:ind w:left="1440" w:hanging="360"/>
+      </w:pPr>
+      <w:rPr>
+        <w:rFonts w:ascii="Courier New" w:hAnsi="Courier New" w:hint="default"/>
+        <w:sz w:val="20"/>
+      </w:rPr>
+    </w:lvl>
+    <w:lvl w:ilvl="2" w:tentative="1">
+      <w:start w:val="1"/>
+      <w:numFmt w:val="bullet"/>
+      <w:lvlText w:val=""/>
+      <w:lvlJc w:val="left"/>
+      <w:pPr>
+        <w:tabs>
+          <w:tab w:val="num" w:pos="2160"/>
+        </w:tabs>
+        <w:ind w:left="2160" w:hanging="360"/>
+      </w:pPr>
+      <w:rPr>
+        <w:rFonts w:ascii="Wingdings" w:hAnsi="Wingdings" w:hint="default"/>
+        <w:sz w:val="20"/>
+      </w:rPr>
+    </w:lvl>
+    <w:lvl w:ilvl="3" w:tentative="1">
+      <w:start w:val="1"/>
+      <w:numFmt w:val="bullet"/>
+      <w:lvlText w:val=""/>
+      <w:lvlJc w:val="left"/>
+      <w:pPr>
+        <w:tabs>
+          <w:tab w:val="num" w:pos="2880"/>
+        </w:tabs>
+        <w:ind w:left="2880" w:hanging="360"/>
+      </w:pPr>
+      <w:rPr>
+        <w:rFonts w:ascii="Wingdings" w:hAnsi="Wingdings" w:hint="default"/>
+        <w:sz w:val="20"/>
+      </w:rPr>
+    </w:lvl>
+    <w:lvl w:ilvl="4" w:tentative="1">
+      <w:start w:val="1"/>
+      <w:numFmt w:val="bullet"/>
+      <w:lvlText w:val=""/>
+      <w:lvlJc w:val="left"/>
+      <w:pPr>
+        <w:tabs>
+          <w:tab w:val="num" w:pos="3600"/>
+        </w:tabs>
+        <w:ind w:left="3600" w:hanging="360"/>
+      </w:pPr>
+      <w:rPr>
+        <w:rFonts w:ascii="Wingdings" w:hAnsi="Wingdings" w:hint="default"/>
+        <w:sz w:val="20"/>
+      </w:rPr>
+    </w:lvl>
+    <w:lvl w:ilvl="5" w:tentative="1">
+      <w:start w:val="1"/>
+      <w:numFmt w:val="bullet"/>
+      <w:lvlText w:val=""/>
+      <w:lvlJc w:val="left"/>
+      <w:pPr>
+        <w:tabs>
+          <w:tab w:val="num" w:pos="4320"/>
+        </w:tabs>
+        <w:ind w:left="4320" w:hanging="360"/>
+      </w:pPr>
+      <w:rPr>
+        <w:rFonts w:ascii="Wingdings" w:hAnsi="Wingdings" w:hint="default"/>
+        <w:sz w:val="20"/>
+      </w:rPr>
+    </w:lvl>
+    <w:lvl w:ilvl="6" w:tentative="1">
+      <w:start w:val="1"/>
+      <w:numFmt w:val="bullet"/>
+      <w:lvlText w:val=""/>
+      <w:lvlJc w:val="left"/>
+      <w:pPr>
+        <w:tabs>
+          <w:tab w:val="num" w:pos="5040"/>
+        </w:tabs>
+        <w:ind w:left="5040" w:hanging="360"/>
+      </w:pPr>
+      <w:rPr>
+        <w:rFonts w:ascii="Wingdings" w:hAnsi="Wingdings" w:hint="default"/>
+        <w:sz w:val="20"/>
+      </w:rPr>
+    </w:lvl>
+    <w:lvl w:ilvl="7" w:tentative="1">
+      <w:start w:val="1"/>
+      <w:numFmt w:val="bullet"/>
+      <w:lvlText w:val=""/>
+      <w:lvlJc w:val="left"/>
+      <w:pPr>
+        <w:tabs>
+          <w:tab w:val="num" w:pos="5760"/>
+        </w:tabs>
+        <w:ind w:left="5760" w:hanging="360"/>
+      </w:pPr>
+      <w:rPr>
+        <w:rFonts w:ascii="Wingdings" w:hAnsi="Wingdings" w:hint="default"/>
+        <w:sz w:val="20"/>
+      </w:rPr>
+    </w:lvl>
+    <w:lvl w:ilvl="8" w:tentative="1">
+      <w:start w:val="1"/>
+      <w:numFmt w:val="bullet"/>
+      <w:lvlText w:val=""/>
+      <w:lvlJc w:val="left"/>
+      <w:pPr>
+        <w:tabs>
+          <w:tab w:val="num" w:pos="6480"/>
+        </w:tabs>
+        <w:ind w:left="6480" w:hanging="360"/>
+      </w:pPr>
+      <w:rPr>
+        <w:rFonts w:ascii="Wingdings" w:hAnsi="Wingdings" w:hint="default"/>
+        <w:sz w:val="20"/>
+      </w:rPr>
+    </w:lvl>
+  </w:abstractNum>
+  <w:abstractNum w:abstractNumId="6" w15:restartNumberingAfterBreak="0">
+    <w:nsid w:val="53F1196E"/>
+    <w:multiLevelType w:val="multilevel"/>
+    <w:tmpl w:val="8390AE06"/>
+    <w:lvl w:ilvl="0">
+      <w:start w:val="1"/>
+      <w:numFmt w:val="decimal"/>
+      <w:lvlText w:val="%1."/>
+      <w:lvlJc w:val="left"/>
+      <w:pPr>
+        <w:tabs>
+          <w:tab w:val="num" w:pos="720"/>
+        </w:tabs>
+        <w:ind w:left="720" w:hanging="360"/>
+      </w:pPr>
+    </w:lvl>
+    <w:lvl w:ilvl="1" w:tentative="1">
+      <w:start w:val="1"/>
+      <w:numFmt w:val="decimal"/>
+      <w:lvlText w:val="%2."/>
+      <w:lvlJc w:val="left"/>
+      <w:pPr>
+        <w:tabs>
+          <w:tab w:val="num" w:pos="1440"/>
+        </w:tabs>
+        <w:ind w:left="1440" w:hanging="360"/>
+      </w:pPr>
+    </w:lvl>
+    <w:lvl w:ilvl="2" w:tentative="1">
+      <w:start w:val="1"/>
+      <w:numFmt w:val="decimal"/>
+      <w:lvlText w:val="%3."/>
+      <w:lvlJc w:val="left"/>
+      <w:pPr>
+        <w:tabs>
+          <w:tab w:val="num" w:pos="2160"/>
+        </w:tabs>
+        <w:ind w:left="2160" w:hanging="360"/>
+      </w:pPr>
+    </w:lvl>
+    <w:lvl w:ilvl="3" w:tentative="1">
+      <w:start w:val="1"/>
+      <w:numFmt w:val="decimal"/>
+      <w:lvlText w:val="%4."/>
+      <w:lvlJc w:val="left"/>
+      <w:pPr>
+        <w:tabs>
+          <w:tab w:val="num" w:pos="2880"/>
+        </w:tabs>
+        <w:ind w:left="2880" w:hanging="360"/>
+      </w:pPr>
+    </w:lvl>
+    <w:lvl w:ilvl="4" w:tentative="1">
+      <w:start w:val="1"/>
+      <w:numFmt w:val="decimal"/>
+      <w:lvlText w:val="%5."/>
+      <w:lvlJc w:val="left"/>
+      <w:pPr>
+        <w:tabs>
+          <w:tab w:val="num" w:pos="3600"/>
+        </w:tabs>
+        <w:ind w:left="3600" w:hanging="360"/>
+      </w:pPr>
+    </w:lvl>
+    <w:lvl w:ilvl="5" w:tentative="1">
+      <w:start w:val="1"/>
+      <w:numFmt w:val="decimal"/>
+      <w:lvlText w:val="%6."/>
+      <w:lvlJc w:val="left"/>
+      <w:pPr>
+        <w:tabs>
+          <w:tab w:val="num" w:pos="4320"/>
+        </w:tabs>
+        <w:ind w:left="4320" w:hanging="360"/>
+      </w:pPr>
+    </w:lvl>
+    <w:lvl w:ilvl="6" w:tentative="1">
+      <w:start w:val="1"/>
+      <w:numFmt w:val="decimal"/>
+      <w:lvlText w:val="%7."/>
+      <w:lvlJc w:val="left"/>
+      <w:pPr>
+        <w:tabs>
+          <w:tab w:val="num" w:pos="5040"/>
+        </w:tabs>
+        <w:ind w:left="5040" w:hanging="360"/>
+      </w:pPr>
+    </w:lvl>
+    <w:lvl w:ilvl="7" w:tentative="1">
+      <w:start w:val="1"/>
+      <w:numFmt w:val="decimal"/>
+      <w:lvlText w:val="%8."/>
+      <w:lvlJc w:val="left"/>
+      <w:pPr>
+        <w:tabs>
+          <w:tab w:val="num" w:pos="5760"/>
+        </w:tabs>
+        <w:ind w:left="5760" w:hanging="360"/>
+      </w:pPr>
+    </w:lvl>
+    <w:lvl w:ilvl="8" w:tentative="1">
+      <w:start w:val="1"/>
+      <w:numFmt w:val="decimal"/>
+      <w:lvlText w:val="%9."/>
+      <w:lvlJc w:val="left"/>
+      <w:pPr>
+        <w:tabs>
+          <w:tab w:val="num" w:pos="6480"/>
+        </w:tabs>
+        <w:ind w:left="6480" w:hanging="360"/>
+      </w:pPr>
+    </w:lvl>
+  </w:abstractNum>
+  <w:abstractNum w:abstractNumId="7" w15:restartNumberingAfterBreak="0">
+    <w:nsid w:val="589E5E98"/>
+    <w:multiLevelType w:val="multilevel"/>
+    <w:tmpl w:val="61C68130"/>
+    <w:lvl w:ilvl="0">
+      <w:start w:val="1"/>
+      <w:numFmt w:val="bullet"/>
+      <w:lvlText w:val=""/>
+      <w:lvlJc w:val="left"/>
+      <w:pPr>
+        <w:tabs>
+          <w:tab w:val="num" w:pos="720"/>
+        </w:tabs>
+        <w:ind w:left="720" w:hanging="360"/>
+      </w:pPr>
+      <w:rPr>
+        <w:rFonts w:ascii="Symbol" w:hAnsi="Symbol" w:hint="default"/>
+        <w:sz w:val="20"/>
+      </w:rPr>
+    </w:lvl>
+    <w:lvl w:ilvl="1">
+      <w:start w:val="1"/>
+      <w:numFmt w:val="bullet"/>
+      <w:lvlText w:val="o"/>
+      <w:lvlJc w:val="left"/>
+      <w:pPr>
+        <w:tabs>
+          <w:tab w:val="num" w:pos="1440"/>
+        </w:tabs>
+        <w:ind w:left="1440" w:hanging="360"/>
+      </w:pPr>
+      <w:rPr>
+        <w:rFonts w:ascii="Courier New" w:hAnsi="Courier New" w:hint="default"/>
+        <w:sz w:val="20"/>
+      </w:rPr>
+    </w:lvl>
+    <w:lvl w:ilvl="2" w:tentative="1">
+      <w:start w:val="1"/>
+      <w:numFmt w:val="bullet"/>
+      <w:lvlText w:val=""/>
+      <w:lvlJc w:val="left"/>
+      <w:pPr>
+        <w:tabs>
+          <w:tab w:val="num" w:pos="2160"/>
+        </w:tabs>
+        <w:ind w:left="2160" w:hanging="360"/>
+      </w:pPr>
+      <w:rPr>
+        <w:rFonts w:ascii="Wingdings" w:hAnsi="Wingdings" w:hint="default"/>
+        <w:sz w:val="20"/>
+      </w:rPr>
+    </w:lvl>
+    <w:lvl w:ilvl="3" w:tentative="1">
+      <w:start w:val="1"/>
+      <w:numFmt w:val="bullet"/>
+      <w:lvlText w:val=""/>
+      <w:lvlJc w:val="left"/>
+      <w:pPr>
+        <w:tabs>
+          <w:tab w:val="num" w:pos="2880"/>
+        </w:tabs>
+        <w:ind w:left="2880" w:hanging="360"/>
+      </w:pPr>
+      <w:rPr>
+        <w:rFonts w:ascii="Wingdings" w:hAnsi="Wingdings" w:hint="default"/>
+        <w:sz w:val="20"/>
+      </w:rPr>
+    </w:lvl>
+    <w:lvl w:ilvl="4" w:tentative="1">
+      <w:start w:val="1"/>
+      <w:numFmt w:val="bullet"/>
+      <w:lvlText w:val=""/>
+      <w:lvlJc w:val="left"/>
+      <w:pPr>
+        <w:tabs>
+          <w:tab w:val="num" w:pos="3600"/>
+        </w:tabs>
+        <w:ind w:left="3600" w:hanging="360"/>
+      </w:pPr>
+      <w:rPr>
+        <w:rFonts w:ascii="Wingdings" w:hAnsi="Wingdings" w:hint="default"/>
+        <w:sz w:val="20"/>
+      </w:rPr>
+    </w:lvl>
+    <w:lvl w:ilvl="5" w:tentative="1">
+      <w:start w:val="1"/>
+      <w:numFmt w:val="bullet"/>
+      <w:lvlText w:val=""/>
+      <w:lvlJc w:val="left"/>
+      <w:pPr>
+        <w:tabs>
+          <w:tab w:val="num" w:pos="4320"/>
+        </w:tabs>
+        <w:ind w:left="4320" w:hanging="360"/>
+      </w:pPr>
+      <w:rPr>
+        <w:rFonts w:ascii="Wingdings" w:hAnsi="Wingdings" w:hint="default"/>
+        <w:sz w:val="20"/>
+      </w:rPr>
+    </w:lvl>
+    <w:lvl w:ilvl="6" w:tentative="1">
+      <w:start w:val="1"/>
+      <w:numFmt w:val="bullet"/>
+      <w:lvlText w:val=""/>
+      <w:lvlJc w:val="left"/>
+      <w:pPr>
+        <w:tabs>
+          <w:tab w:val="num" w:pos="5040"/>
+        </w:tabs>
+        <w:ind w:left="5040" w:hanging="360"/>
+      </w:pPr>
+      <w:rPr>
+        <w:rFonts w:ascii="Wingdings" w:hAnsi="Wingdings" w:hint="default"/>
+        <w:sz w:val="20"/>
+      </w:rPr>
+    </w:lvl>
+    <w:lvl w:ilvl="7" w:tentative="1">
+      <w:start w:val="1"/>
+      <w:numFmt w:val="bullet"/>
+      <w:lvlText w:val=""/>
+      <w:lvlJc w:val="left"/>
+      <w:pPr>
+        <w:tabs>
+          <w:tab w:val="num" w:pos="5760"/>
+        </w:tabs>
+        <w:ind w:left="5760" w:hanging="360"/>
+      </w:pPr>
+      <w:rPr>
+        <w:rFonts w:ascii="Wingdings" w:hAnsi="Wingdings" w:hint="default"/>
+        <w:sz w:val="20"/>
+      </w:rPr>
+    </w:lvl>
+    <w:lvl w:ilvl="8" w:tentative="1">
+      <w:start w:val="1"/>
+      <w:numFmt w:val="bullet"/>
+      <w:lvlText w:val=""/>
+      <w:lvlJc w:val="left"/>
+      <w:pPr>
+        <w:tabs>
+          <w:tab w:val="num" w:pos="6480"/>
+        </w:tabs>
+        <w:ind w:left="6480" w:hanging="360"/>
+      </w:pPr>
+      <w:rPr>
+        <w:rFonts w:ascii="Wingdings" w:hAnsi="Wingdings" w:hint="default"/>
+        <w:sz w:val="20"/>
+      </w:rPr>
+    </w:lvl>
+  </w:abstractNum>
+  <w:abstractNum w:abstractNumId="8" w15:restartNumberingAfterBreak="0">
+    <w:nsid w:val="644E5C68"/>
+    <w:multiLevelType w:val="multilevel"/>
+    <w:tmpl w:val="9EBACD7C"/>
+    <w:lvl w:ilvl="0">
+      <w:start w:val="1"/>
+      <w:numFmt w:val="bullet"/>
+      <w:lvlText w:val=""/>
+      <w:lvlJc w:val="left"/>
+      <w:pPr>
+        <w:tabs>
+          <w:tab w:val="num" w:pos="720"/>
+        </w:tabs>
+        <w:ind w:left="720" w:hanging="360"/>
+      </w:pPr>
+      <w:rPr>
+        <w:rFonts w:ascii="Symbol" w:hAnsi="Symbol" w:hint="default"/>
+        <w:sz w:val="20"/>
+      </w:rPr>
+    </w:lvl>
+    <w:lvl w:ilvl="1" w:tentative="1">
+      <w:start w:val="1"/>
+      <w:numFmt w:val="bullet"/>
+      <w:lvlText w:val="o"/>
+      <w:lvlJc w:val="left"/>
+      <w:pPr>
+        <w:tabs>
+          <w:tab w:val="num" w:pos="1440"/>
+        </w:tabs>
+        <w:ind w:left="1440" w:hanging="360"/>
+      </w:pPr>
+      <w:rPr>
+        <w:rFonts w:ascii="Courier New" w:hAnsi="Courier New" w:hint="default"/>
+        <w:sz w:val="20"/>
+      </w:rPr>
+    </w:lvl>
+    <w:lvl w:ilvl="2" w:tentative="1">
+      <w:start w:val="1"/>
+      <w:numFmt w:val="bullet"/>
+      <w:lvlText w:val=""/>
+      <w:lvlJc w:val="left"/>
+      <w:pPr>
+        <w:tabs>
+          <w:tab w:val="num" w:pos="2160"/>
+        </w:tabs>
+        <w:ind w:left="2160" w:hanging="360"/>
+      </w:pPr>
+      <w:rPr>
+        <w:rFonts w:ascii="Wingdings" w:hAnsi="Wingdings" w:hint="default"/>
+        <w:sz w:val="20"/>
+      </w:rPr>
+    </w:lvl>
+    <w:lvl w:ilvl="3" w:tentative="1">
+      <w:start w:val="1"/>
+      <w:numFmt w:val="bullet"/>
+      <w:lvlText w:val=""/>
+      <w:lvlJc w:val="left"/>
+      <w:pPr>
+        <w:tabs>
+          <w:tab w:val="num" w:pos="2880"/>
+        </w:tabs>
+        <w:ind w:left="2880" w:hanging="360"/>
+      </w:pPr>
+      <w:rPr>
+        <w:rFonts w:ascii="Wingdings" w:hAnsi="Wingdings" w:hint="default"/>
+        <w:sz w:val="20"/>
+      </w:rPr>
+    </w:lvl>
+    <w:lvl w:ilvl="4" w:tentative="1">
+      <w:start w:val="1"/>
+      <w:numFmt w:val="bullet"/>
+      <w:lvlText w:val=""/>
+      <w:lvlJc w:val="left"/>
+      <w:pPr>
+        <w:tabs>
+          <w:tab w:val="num" w:pos="3600"/>
+        </w:tabs>
+        <w:ind w:left="3600" w:hanging="360"/>
+      </w:pPr>
+      <w:rPr>
+        <w:rFonts w:ascii="Wingdings" w:hAnsi="Wingdings" w:hint="default"/>
+        <w:sz w:val="20"/>
+      </w:rPr>
+    </w:lvl>
+    <w:lvl w:ilvl="5" w:tentative="1">
+      <w:start w:val="1"/>
+      <w:numFmt w:val="bullet"/>
+      <w:lvlText w:val=""/>
+      <w:lvlJc w:val="left"/>
+      <w:pPr>
+        <w:tabs>
+          <w:tab w:val="num" w:pos="4320"/>
+        </w:tabs>
+        <w:ind w:left="4320" w:hanging="360"/>
+      </w:pPr>
+      <w:rPr>
+        <w:rFonts w:ascii="Wingdings" w:hAnsi="Wingdings" w:hint="default"/>
+        <w:sz w:val="20"/>
+      </w:rPr>
+    </w:lvl>
+    <w:lvl w:ilvl="6" w:tentative="1">
+      <w:start w:val="1"/>
+      <w:numFmt w:val="bullet"/>
+      <w:lvlText w:val=""/>
+      <w:lvlJc w:val="left"/>
+      <w:pPr>
+        <w:tabs>
+          <w:tab w:val="num" w:pos="5040"/>
+        </w:tabs>
+        <w:ind w:left="5040" w:hanging="360"/>
+      </w:pPr>
+      <w:rPr>
+        <w:rFonts w:ascii="Wingdings" w:hAnsi="Wingdings" w:hint="default"/>
+        <w:sz w:val="20"/>
+      </w:rPr>
+    </w:lvl>
+    <w:lvl w:ilvl="7" w:tentative="1">
+      <w:start w:val="1"/>
+      <w:numFmt w:val="bullet"/>
+      <w:lvlText w:val=""/>
+      <w:lvlJc w:val="left"/>
+      <w:pPr>
+        <w:tabs>
+          <w:tab w:val="num" w:pos="5760"/>
+        </w:tabs>
+        <w:ind w:left="5760" w:hanging="360"/>
+      </w:pPr>
+      <w:rPr>
+        <w:rFonts w:ascii="Wingdings" w:hAnsi="Wingdings" w:hint="default"/>
+        <w:sz w:val="20"/>
+      </w:rPr>
+    </w:lvl>
+    <w:lvl w:ilvl="8" w:tentative="1">
+      <w:start w:val="1"/>
+      <w:numFmt w:val="bullet"/>
+      <w:lvlText w:val=""/>
+      <w:lvlJc w:val="left"/>
+      <w:pPr>
+        <w:tabs>
+          <w:tab w:val="num" w:pos="6480"/>
+        </w:tabs>
+        <w:ind w:left="6480" w:hanging="360"/>
+      </w:pPr>
+      <w:rPr>
+        <w:rFonts w:ascii="Wingdings" w:hAnsi="Wingdings" w:hint="default"/>
+        <w:sz w:val="20"/>
+      </w:rPr>
+    </w:lvl>
+  </w:abstractNum>
+  <w:abstractNum w:abstractNumId="9" w15:restartNumberingAfterBreak="0">
+    <w:nsid w:val="7E1C4974"/>
+    <w:multiLevelType w:val="multilevel"/>
+    <w:tmpl w:val="468492F6"/>
+    <w:lvl w:ilvl="0">
+      <w:start w:val="1"/>
+      <w:numFmt w:val="bullet"/>
+      <w:lvlText w:val=""/>
+      <w:lvlJc w:val="left"/>
+      <w:pPr>
+        <w:tabs>
+          <w:tab w:val="num" w:pos="720"/>
+        </w:tabs>
+        <w:ind w:left="720" w:hanging="360"/>
+      </w:pPr>
+      <w:rPr>
+        <w:rFonts w:ascii="Symbol" w:hAnsi="Symbol" w:hint="default"/>
+        <w:sz w:val="20"/>
+      </w:rPr>
+    </w:lvl>
+    <w:lvl w:ilvl="1" w:tentative="1">
+      <w:start w:val="1"/>
+      <w:numFmt w:val="bullet"/>
+      <w:lvlText w:val="o"/>
+      <w:lvlJc w:val="left"/>
+      <w:pPr>
+        <w:tabs>
+          <w:tab w:val="num" w:pos="1440"/>
+        </w:tabs>
+        <w:ind w:left="1440" w:hanging="360"/>
+      </w:pPr>
+      <w:rPr>
+        <w:rFonts w:ascii="Courier New" w:hAnsi="Courier New" w:hint="default"/>
+        <w:sz w:val="20"/>
+      </w:rPr>
+    </w:lvl>
+    <w:lvl w:ilvl="2" w:tentative="1">
+      <w:start w:val="1"/>
+      <w:numFmt w:val="bullet"/>
+      <w:lvlText w:val=""/>
+      <w:lvlJc w:val="left"/>
+      <w:pPr>
+        <w:tabs>
+          <w:tab w:val="num" w:pos="2160"/>
+        </w:tabs>
+        <w:ind w:left="2160" w:hanging="360"/>
+      </w:pPr>
+      <w:rPr>
+        <w:rFonts w:ascii="Wingdings" w:hAnsi="Wingdings" w:hint="default"/>
+        <w:sz w:val="20"/>
+      </w:rPr>
+    </w:lvl>
+    <w:lvl w:ilvl="3" w:tentative="1">
+      <w:start w:val="1"/>
+      <w:numFmt w:val="bullet"/>
+      <w:lvlText w:val=""/>
+      <w:lvlJc w:val="left"/>
+      <w:pPr>
+        <w:tabs>
+          <w:tab w:val="num" w:pos="2880"/>
+        </w:tabs>
+        <w:ind w:left="2880" w:hanging="360"/>
+      </w:pPr>
+      <w:rPr>
+        <w:rFonts w:ascii="Wingdings" w:hAnsi="Wingdings" w:hint="default"/>
+        <w:sz w:val="20"/>
+      </w:rPr>
+    </w:lvl>
+    <w:lvl w:ilvl="4" w:tentative="1">
+      <w:start w:val="1"/>
+      <w:numFmt w:val="bullet"/>
+      <w:lvlText w:val=""/>
+      <w:lvlJc w:val="left"/>
+      <w:pPr>
+        <w:tabs>
+          <w:tab w:val="num" w:pos="3600"/>
+        </w:tabs>
+        <w:ind w:left="3600" w:hanging="360"/>
+      </w:pPr>
+      <w:rPr>
+        <w:rFonts w:ascii="Wingdings" w:hAnsi="Wingdings" w:hint="default"/>
+        <w:sz w:val="20"/>
+      </w:rPr>
+    </w:lvl>
+    <w:lvl w:ilvl="5" w:tentative="1">
+      <w:start w:val="1"/>
+      <w:numFmt w:val="bullet"/>
+      <w:lvlText w:val=""/>
+      <w:lvlJc w:val="left"/>
+      <w:pPr>
+        <w:tabs>
+          <w:tab w:val="num" w:pos="4320"/>
+        </w:tabs>
+        <w:ind w:left="4320" w:hanging="360"/>
+      </w:pPr>
+      <w:rPr>
+        <w:rFonts w:ascii="Wingdings" w:hAnsi="Wingdings" w:hint="default"/>
+        <w:sz w:val="20"/>
+      </w:rPr>
+    </w:lvl>
+    <w:lvl w:ilvl="6" w:tentative="1">
+      <w:start w:val="1"/>
+      <w:numFmt w:val="bullet"/>
+      <w:lvlText w:val=""/>
+      <w:lvlJc w:val="left"/>
+      <w:pPr>
+        <w:tabs>
+          <w:tab w:val="num" w:pos="5040"/>
+        </w:tabs>
+        <w:ind w:left="5040" w:hanging="360"/>
+      </w:pPr>
+      <w:rPr>
+        <w:rFonts w:ascii="Wingdings" w:hAnsi="Wingdings" w:hint="default"/>
+        <w:sz w:val="20"/>
+      </w:rPr>
+    </w:lvl>
+    <w:lvl w:ilvl="7" w:tentative="1">
+      <w:start w:val="1"/>
+      <w:numFmt w:val="bullet"/>
+      <w:lvlText w:val=""/>
+      <w:lvlJc w:val="left"/>
+      <w:pPr>
+        <w:tabs>
+          <w:tab w:val="num" w:pos="5760"/>
+        </w:tabs>
+        <w:ind w:left="5760" w:hanging="360"/>
+      </w:pPr>
+      <w:rPr>
+        <w:rFonts w:ascii="Wingdings" w:hAnsi="Wingdings" w:hint="default"/>
+        <w:sz w:val="20"/>
+      </w:rPr>
+    </w:lvl>
+    <w:lvl w:ilvl="8" w:tentative="1">
+      <w:start w:val="1"/>
+      <w:numFmt w:val="bullet"/>
+      <w:lvlText w:val=""/>
+      <w:lvlJc w:val="left"/>
+      <w:pPr>
+        <w:tabs>
+          <w:tab w:val="num" w:pos="6480"/>
+        </w:tabs>
+        <w:ind w:left="6480" w:hanging="360"/>
+      </w:pPr>
+      <w:rPr>
+        <w:rFonts w:ascii="Wingdings" w:hAnsi="Wingdings" w:hint="default"/>
+        <w:sz w:val="20"/>
+      </w:rPr>
+    </w:lvl>
+  </w:abstractNum>
   <w:num w:numId="1">
+    <w:abstractNumId w:val="3"/>
+  </w:num>
+  <w:num w:numId="2">
+    <w:abstractNumId w:val="5"/>
+  </w:num>
+  <w:num w:numId="3">
+    <w:abstractNumId w:val="9"/>
+  </w:num>
+  <w:num w:numId="4">
     <w:abstractNumId w:val="1"/>
   </w:num>
-  <w:num w:numId="2">
+  <w:num w:numId="5">
+    <w:abstractNumId w:val="0"/>
+  </w:num>
+  <w:num w:numId="6">
+    <w:abstractNumId w:val="6"/>
+  </w:num>
+  <w:num w:numId="7">
+    <w:abstractNumId w:val="8"/>
+  </w:num>
+  <w:num w:numId="8">
+    <w:abstractNumId w:val="7"/>
+  </w:num>
+  <w:num w:numId="9">
+    <w:abstractNumId w:val="4"/>
+  </w:num>
+  <w:num w:numId="10">
     <w:abstractNumId w:val="2"/>
-  </w:num>
-  <w:num w:numId="3">
-    <w:abstractNumId w:val="3"/>
-  </w:num>
-  <w:num w:numId="4">
-    <w:abstractNumId w:val="0"/>
   </w:num>
 </w:numbering>
 </file>
@@ -8259,6 +9892,16 @@
       <w:lang w:eastAsia="en-IN" w:bidi="hi-IN"/>
     </w:rPr>
   </w:style>
+  <w:style w:type="character" w:customStyle="1" w:styleId="s">
+    <w:name w:val="ͼs"/>
+    <w:basedOn w:val="DefaultParagraphFont"/>
+    <w:rsid w:val="002E27CC"/>
+  </w:style>
+  <w:style w:type="character" w:customStyle="1" w:styleId="r">
+    <w:name w:val="ͼr"/>
+    <w:basedOn w:val="DefaultParagraphFont"/>
+    <w:rsid w:val="002E27CC"/>
+  </w:style>
 </w:styles>
 </file>
 

</xml_diff>